<commit_message>
Built site for fxtas@0.0.0.9053: bec00e0
</commit_message>
<xml_diff>
--- a/articles/demo-table-subtype-by-demographics.docx
+++ b/articles/demo-table-subtype-by-demographics.docx
@@ -330,7 +330,7 @@
       <w:tr>
         <w:tc>
           <w:tcPr/>
-          <w:bookmarkStart w:id="20" w:name="tbl-tab1"/>
+          <w:bookmarkStart w:id="9" w:name="tbl-tab1"/>
           <w:p>
             <w:pPr>
               <w:jc w:val="center"/>
@@ -359,10 +359,9 @@
             </w:tblGrid>
             <w:tr>
               <w:trPr>
-                <w:trHeight w:val="786" w:hRule="auto"/>
+                <w:trHeight w:val="902" w:hRule="auto"/>
                 <w:tblHeader/>
               </w:trPr>
-              header1
               <w:tc>
                 <w:tcPr>
                   <w:tcBorders>
@@ -795,9 +794,8 @@
             </w:tr>
             <w:tr>
               <w:trPr>
-                <w:trHeight w:val="607" w:hRule="auto"/>
+                <w:trHeight w:val="608" w:hRule="auto"/>
               </w:trPr>
-              body1
               <w:tc>
                 <w:tcPr>
                   <w:tcBorders>
@@ -1085,9 +1083,8 @@
             </w:tr>
             <w:tr>
               <w:trPr>
-                <w:trHeight w:val="607" w:hRule="auto"/>
+                <w:trHeight w:val="608" w:hRule="auto"/>
               </w:trPr>
-              body2
               <w:tc>
                 <w:tcPr>
                   <w:tcBorders>
@@ -1361,9 +1358,8 @@
             </w:tr>
             <w:tr>
               <w:trPr>
-                <w:trHeight w:val="607" w:hRule="auto"/>
+                <w:trHeight w:val="623" w:hRule="auto"/>
               </w:trPr>
-              body3
               <w:tc>
                 <w:tcPr>
                   <w:tcBorders>
@@ -1639,7 +1635,6 @@
               <w:trPr>
                 <w:trHeight w:val="360" w:hRule="auto"/>
               </w:trPr>
-              footer1
               <w:tc>
                 <w:tcPr>
                   <w:gridSpan w:val="5"/>
@@ -1714,7 +1709,6 @@
               <w:trPr>
                 <w:trHeight w:val="360" w:hRule="auto"/>
               </w:trPr>
-              footer2
               <w:tc>
                 <w:tcPr>
                   <w:gridSpan w:val="5"/>
@@ -1786,7 +1780,7 @@
               </w:tc>
             </w:tr>
           </w:tbl>
-          <w:bookmarkEnd w:id="20"/>
+          <w:bookmarkEnd w:id="9"/>
         </w:tc>
       </w:tr>
     </w:tbl>
@@ -1911,10 +1905,10 @@
   <w:docDefaults>
     <w:rPrDefault>
       <w:rPr>
-        <w:rFonts w:asciiTheme="minorHAnsi" w:cstheme="minorBidi" w:eastAsiaTheme="minorHAnsi" w:hAnsiTheme="minorHAnsi"/>
+        <w:rFonts w:asciiTheme="minorHAnsi" w:cstheme="minorBidi" w:eastAsiaTheme="minorEastAsia" w:hAnsiTheme="minorHAnsi"/>
         <w:sz w:val="24"/>
         <w:szCs w:val="24"/>
-        <w:lang w:bidi="ar-SA" w:eastAsia="en-US" w:val="en-US"/>
+        <w:lang w:bidi="ar-SA" w:eastAsia="zh-CN" w:val="en-US"/>
       </w:rPr>
     </w:rPrDefault>
     <w:pPrDefault>
@@ -2455,13 +2449,6 @@
       </w:tblCellMar>
     </w:tblPr>
     <w:tblStylePr w:type="firstRow">
-      <w:tblPr>
-        <w:jc w:val="left"/>
-        <w:tblInd w:type="dxa" w:w="0"/>
-      </w:tblPr>
-      <w:trPr>
-        <w:jc w:val="left"/>
-      </w:trPr>
       <w:tcPr>
         <w:tcBorders>
           <w:bottom w:val="single"/>

</xml_diff>